<commit_message>
sync: 同步模板更新 2026/5/19 23:50:28
</commit_message>
<xml_diff>
--- a/visual_m06/docs/数学教具产品线 — 产品需求文档（PRD）.docx
+++ b/visual_m06/docs/数学教具产品线 — 产品需求文档（PRD）.docx
@@ -21049,6 +21049,524 @@
         <w:ind w:left="0"/>
         <w:jc w:val="left"/>
       </w:pPr>
+    </w:p>
+    <w:p/>
+    <w:p>
+      <w:r>
+        <w:rPr>
+          <w:b w:val="0"/>
+          <w:color w:val="1A1A2E"/>
+          <w:sz w:val="22"/>
+        </w:rPr>
+        <w:t>════════════════════════════════════════</w:t>
+      </w:r>
+    </w:p>
+    <w:p/>
+    <w:p>
+      <w:r>
+        <w:rPr>
+          <w:b/>
+          <w:color w:val="1A1A2E"/>
+          <w:sz w:val="36"/>
+        </w:rPr>
+        <w:t>M-06 向量运算演示台 · V0.2 功能演示清单</w:t>
+      </w:r>
+    </w:p>
+    <w:p>
+      <w:r>
+        <w:rPr>
+          <w:b/>
+          <w:sz w:val="22"/>
+        </w:rPr>
+        <w:t>更新日期：2026-03-23　　回应 V0.1 反馈意见</w:t>
+      </w:r>
+    </w:p>
+    <w:p/>
+    <w:p>
+      <w:r>
+        <w:rPr>
+          <w:b/>
+          <w:color w:val="1A1A2E"/>
+          <w:sz w:val="28"/>
+        </w:rPr>
+        <w:t>一、V0.1 反馈意见回应</w:t>
+      </w:r>
+    </w:p>
+    <w:p>
+      <w:r>
+        <w:rPr>
+          <w:b/>
+          <w:sz w:val="22"/>
+        </w:rPr>
+        <w:t>1. 「面板选一个向量 → 画布 hover 高亮对应几何图」</w:t>
+      </w:r>
+    </w:p>
+    <w:p>
+      <w:r>
+        <w:rPr>
+          <w:b w:val="0"/>
+          <w:sz w:val="22"/>
+        </w:rPr>
+        <w:t>→ 已实现。选中向量/运算后，画布上对应的箭头、端点、运算结果线段均高亮显示（蓝色描边 + 放大端点）。点击画布空白处取消选中。</w:t>
+      </w:r>
+    </w:p>
+    <w:p/>
+    <w:p>
+      <w:r>
+        <w:rPr>
+          <w:b/>
+          <w:sz w:val="22"/>
+        </w:rPr>
+        <w:t>2. 「VecOp 列表里选中一条 → 画布虚线结果段也跟着高亮」</w:t>
+      </w:r>
+    </w:p>
+    <w:p>
+      <w:r>
+        <w:rPr>
+          <w:b w:val="0"/>
+          <w:sz w:val="22"/>
+        </w:rPr>
+        <w:t>→ 已实现。运算结果线段（虚线箭头）支持 hover 高亮和 click 选中。选中运算时，其结果向量在画布上以蓝色高亮 + 端点放大展示。</w:t>
+      </w:r>
+    </w:p>
+    <w:p/>
+    <w:p>
+      <w:r>
+        <w:rPr>
+          <w:b/>
+          <w:sz w:val="22"/>
+        </w:rPr>
+        <w:t>3. 「运算的结果向量也能当操作数，再做加减标量乘」</w:t>
+      </w:r>
+    </w:p>
+    <w:p>
+      <w:r>
+        <w:rPr>
+          <w:b w:val="0"/>
+          <w:sz w:val="22"/>
+        </w:rPr>
+        <w:t>→ 已实现。在「向量运算」区选择操作数时，不仅可以选原始向量，也可以选中已有运算的结果向量（非点积类型），支持任意层级嵌套。例如：先做 a⃗+b⃗ 得到 op1，再做 op1·2 = 标量乘。系统内置环路检测，防止循环依赖。</w:t>
+      </w:r>
+    </w:p>
+    <w:p/>
+    <w:p>
+      <w:r>
+        <w:rPr>
+          <w:b/>
+          <w:sz w:val="22"/>
+        </w:rPr>
+        <w:t>4. 「加一组 Presets / Demos，老师一键加载经典场景」</w:t>
+      </w:r>
+    </w:p>
+    <w:p>
+      <w:r>
+        <w:rPr>
+          <w:b w:val="0"/>
+          <w:sz w:val="22"/>
+        </w:rPr>
+        <w:t>→ V0.1 已内置 29 个预设场景（VEC-011 ~ VEC-062），覆盖平行四边形法则、三角形法则、向量减法、标量乘法、点积投影、向量分解、空间向量、叉积等全部 8 种运算类型。</w:t>
+      </w:r>
+    </w:p>
+    <w:p/>
+    <w:p>
+      <w:r>
+        <w:rPr>
+          <w:b/>
+          <w:sz w:val="22"/>
+        </w:rPr>
+        <w:t>5. 「面板太宽占半屏」</w:t>
+      </w:r>
+    </w:p>
+    <w:p>
+      <w:r>
+        <w:rPr>
+          <w:b w:val="0"/>
+          <w:sz w:val="22"/>
+        </w:rPr>
+        <w:t>→ V0.1 面板已采用紧凑布局，宽度 320px，不超过屏幕 1/4。各区块折叠/展开，信息密度合理。</w:t>
+      </w:r>
+    </w:p>
+    <w:p/>
+    <w:p>
+      <w:r>
+        <w:rPr>
+          <w:b/>
+          <w:color w:val="1A1A2E"/>
+          <w:sz w:val="28"/>
+        </w:rPr>
+        <w:t>二、V0.2 新增功能详述</w:t>
+      </w:r>
+    </w:p>
+    <w:p>
+      <w:r>
+        <w:rPr>
+          <w:b/>
+          <w:color w:val="1A1A2E"/>
+          <w:sz w:val="24"/>
+        </w:rPr>
+        <w:t>2.1 端点绑定系统</w:t>
+      </w:r>
+    </w:p>
+    <w:p>
+      <w:r>
+        <w:rPr>
+          <w:b w:val="0"/>
+          <w:sz w:val="22"/>
+        </w:rPr>
+        <w:t>• 功能：任意两个端点（起点或终点）可建立绑定关系，绑定后同步移动。</w:t>
+      </w:r>
+    </w:p>
+    <w:p>
+      <w:r>
+        <w:rPr>
+          <w:b w:val="0"/>
+          <w:sz w:val="22"/>
+        </w:rPr>
+        <w:t>• 操作：面板「端点绑定」区 → 选择点 A → 选择点 B → 自动将 B 移动到 A 位置并建立绑定。</w:t>
+      </w:r>
+    </w:p>
+    <w:p>
+      <w:r>
+        <w:rPr>
+          <w:b w:val="0"/>
+          <w:sz w:val="22"/>
+        </w:rPr>
+        <w:t>• 解绑：已绑定的端点旁显示解绑按钮，点击即可解除。</w:t>
+      </w:r>
+    </w:p>
+    <w:p>
+      <w:r>
+        <w:rPr>
+          <w:b w:val="0"/>
+          <w:sz w:val="22"/>
+        </w:rPr>
+        <w:t>• 级联删除：删除向量时自动清理其端点相关的绑定。</w:t>
+      </w:r>
+    </w:p>
+    <w:p>
+      <w:r>
+        <w:rPr>
+          <w:b w:val="0"/>
+          <w:sz w:val="22"/>
+        </w:rPr>
+        <w:t>• 传递性：A↔B、B↔C 绑定后，移动 A 时 B 和 C 同步移动（传递闭包）。</w:t>
+      </w:r>
+    </w:p>
+    <w:p/>
+    <w:p>
+      <w:r>
+        <w:rPr>
+          <w:b/>
+          <w:color w:val="1A1A2E"/>
+          <w:sz w:val="24"/>
+        </w:rPr>
+        <w:t>2.2 约束与绑定交互</w:t>
+      </w:r>
+    </w:p>
+    <w:p>
+      <w:r>
+        <w:rPr>
+          <w:b w:val="0"/>
+          <w:sz w:val="22"/>
+        </w:rPr>
+        <w:t>• 约束类型：固定起点 + 固定模长 → 终点轨迹为圆。</w:t>
+      </w:r>
+    </w:p>
+    <w:p>
+      <w:r>
+        <w:rPr>
+          <w:b w:val="0"/>
+          <w:sz w:val="22"/>
+        </w:rPr>
+        <w:t>• 约束模长输入支持 √ 表达式：如 √2、3√5，面板输入框旁有 √ 快捷按钮。</w:t>
+      </w:r>
+    </w:p>
+    <w:p>
+      <w:r>
+        <w:rPr>
+          <w:b w:val="0"/>
+          <w:sz w:val="22"/>
+        </w:rPr>
+        <w:t>• 绑定冲突检测（创建绑定时自动校验）：</w:t>
+      </w:r>
+    </w:p>
+    <w:p>
+      <w:r>
+        <w:rPr>
+          <w:b w:val="0"/>
+          <w:sz w:val="22"/>
+        </w:rPr>
+        <w:t xml:space="preserve">　　- 两个锚定起点不可互相绑定（🔒标记，灰色不可选）。</w:t>
+      </w:r>
+    </w:p>
+    <w:p>
+      <w:r>
+        <w:rPr>
+          <w:b w:val="0"/>
+          <w:sz w:val="22"/>
+        </w:rPr>
+        <w:t xml:space="preserve">　　- 单圆约束：被绑定点投影到约束圆上最近点。</w:t>
+      </w:r>
+    </w:p>
+    <w:p>
+      <w:r>
+        <w:rPr>
+          <w:b w:val="0"/>
+          <w:sz w:val="22"/>
+        </w:rPr>
+        <w:t xml:space="preserve">　　- 双圆约束：两个约束圆必须有交点才允许绑定，交点不存在时禁止选择并显示提示。</w:t>
+      </w:r>
+    </w:p>
+    <w:p>
+      <w:r>
+        <w:rPr>
+          <w:b w:val="0"/>
+          <w:sz w:val="22"/>
+        </w:rPr>
+        <w:t>• 拖拽行为：</w:t>
+      </w:r>
+    </w:p>
+    <w:p>
+      <w:r>
+        <w:rPr>
+          <w:b w:val="0"/>
+          <w:sz w:val="22"/>
+        </w:rPr>
+        <w:t xml:space="preserve">　　- 单约束：拖拽时投影到圆弧上。</w:t>
+      </w:r>
+    </w:p>
+    <w:p>
+      <w:r>
+        <w:rPr>
+          <w:b w:val="0"/>
+          <w:sz w:val="22"/>
+        </w:rPr>
+        <w:t xml:space="preserve">　　- 双约束（两圆交点）：终点只能在两个交点间切换，光标靠近哪个就吸附哪个。</w:t>
+      </w:r>
+    </w:p>
+    <w:p>
+      <w:r>
+        <w:rPr>
+          <w:b w:val="0"/>
+          <w:sz w:val="22"/>
+        </w:rPr>
+        <w:t xml:space="preserve">　　- 多约束传递：通过绑定链收集所有约束圆，逐步求交筛选可行点。</w:t>
+      </w:r>
+    </w:p>
+    <w:p/>
+    <w:p>
+      <w:r>
+        <w:rPr>
+          <w:b/>
+          <w:color w:val="1A1A2E"/>
+          <w:sz w:val="24"/>
+        </w:rPr>
+        <w:t>2.3 嵌套运算（运算结果作为操作数）</w:t>
+      </w:r>
+    </w:p>
+    <w:p>
+      <w:r>
+        <w:rPr>
+          <w:b w:val="0"/>
+          <w:sz w:val="22"/>
+        </w:rPr>
+        <w:t>• 运算结果（非点积）可作为后续运算的操作数，支持多层嵌套。</w:t>
+      </w:r>
+    </w:p>
+    <w:p>
+      <w:r>
+        <w:rPr>
+          <w:b w:val="0"/>
+          <w:sz w:val="22"/>
+        </w:rPr>
+        <w:t>• 面板显示递归表达式标签，如 (a⃗+b⃗)×2。</w:t>
+      </w:r>
+    </w:p>
+    <w:p>
+      <w:r>
+        <w:rPr>
+          <w:b w:val="0"/>
+          <w:sz w:val="22"/>
+        </w:rPr>
+        <w:t>• 画布渲染递归解析起点和方向，正确绘制嵌套结果。</w:t>
+      </w:r>
+    </w:p>
+    <w:p>
+      <w:r>
+        <w:rPr>
+          <w:b w:val="0"/>
+          <w:sz w:val="22"/>
+        </w:rPr>
+        <w:t>• 内置环路检测：选择操作数时自动检查是否形成循环依赖，若检测到则禁止选择。</w:t>
+      </w:r>
+    </w:p>
+    <w:p>
+      <w:r>
+        <w:rPr>
+          <w:b w:val="0"/>
+          <w:sz w:val="22"/>
+        </w:rPr>
+        <w:t>• 删除运算时级联删除所有引用该运算的子运算。</w:t>
+      </w:r>
+    </w:p>
+    <w:p/>
+    <w:p>
+      <w:r>
+        <w:rPr>
+          <w:b/>
+          <w:color w:val="1A1A2E"/>
+          <w:sz w:val="24"/>
+        </w:rPr>
+        <w:t>2.4 画布交互优化</w:t>
+      </w:r>
+    </w:p>
+    <w:p>
+      <w:r>
+        <w:rPr>
+          <w:b w:val="0"/>
+          <w:sz w:val="22"/>
+        </w:rPr>
+        <w:t>• 运算结果线段支持 hover 高亮 + click 选中（与原始向量一致）。</w:t>
+      </w:r>
+    </w:p>
+    <w:p>
+      <w:r>
+        <w:rPr>
+          <w:b w:val="0"/>
+          <w:sz w:val="22"/>
+        </w:rPr>
+        <w:t>• 首尾相接（三角形法则）标签移至向量中点，避免尾部标签与求和标签重叠。</w:t>
+      </w:r>
+    </w:p>
+    <w:p>
+      <w:r>
+        <w:rPr>
+          <w:b w:val="0"/>
+          <w:sz w:val="22"/>
+        </w:rPr>
+        <w:t>• 拖拽端点时，绑定组内所有点同步移动，约束实时生效。</w:t>
+      </w:r>
+    </w:p>
+    <w:p/>
+    <w:p>
+      <w:r>
+        <w:rPr>
+          <w:b/>
+          <w:color w:val="1A1A2E"/>
+          <w:sz w:val="28"/>
+        </w:rPr>
+        <w:t>三、技术实现要点</w:t>
+      </w:r>
+    </w:p>
+    <w:p>
+      <w:r>
+        <w:rPr>
+          <w:b/>
+          <w:sz w:val="22"/>
+        </w:rPr>
+        <w:t>数据模型：</w:t>
+      </w:r>
+      <w:r>
+        <w:rPr>
+          <w:sz w:val="22"/>
+        </w:rPr>
+        <w:t>DemoBinding { id, pointA, pointB } 存储于 zustand store，快照包含 bindings 数组。</w:t>
+      </w:r>
+    </w:p>
+    <w:p>
+      <w:r>
+        <w:rPr>
+          <w:b/>
+          <w:sz w:val="22"/>
+        </w:rPr>
+        <w:t>命令模式：</w:t>
+      </w:r>
+      <w:r>
+        <w:rPr>
+          <w:sz w:val="22"/>
+        </w:rPr>
+        <w:t>BindPointsCmd / UnbindPointsCmd 完整支持 Undo/Redo。</w:t>
+      </w:r>
+    </w:p>
+    <w:p>
+      <w:r>
+        <w:rPr>
+          <w:b/>
+          <w:sz w:val="22"/>
+        </w:rPr>
+        <w:t>传递闭包：</w:t>
+      </w:r>
+      <w:r>
+        <w:rPr>
+          <w:sz w:val="22"/>
+        </w:rPr>
+        <w:t>getBoundGroup() 使用 flood-fill 算法收集绑定链上所有点。</w:t>
+      </w:r>
+    </w:p>
+    <w:p>
+      <w:r>
+        <w:rPr>
+          <w:b/>
+          <w:sz w:val="22"/>
+        </w:rPr>
+        <w:t>圆-圆交点：</w:t>
+      </w:r>
+      <w:r>
+        <w:rPr>
+          <w:sz w:val="22"/>
+        </w:rPr>
+        <w:t>解析几何精确求解，d² = (x₂-x₁)² + (y₂-y₁)²，判别式 h² = r₁² - a² 决定交点数。</w:t>
+      </w:r>
+    </w:p>
+    <w:p>
+      <w:r>
+        <w:rPr>
+          <w:b/>
+          <w:sz w:val="22"/>
+        </w:rPr>
+        <w:t>递归解析：</w:t>
+      </w:r>
+      <w:r>
+        <w:rPr>
+          <w:sz w:val="22"/>
+        </w:rPr>
+        <w:t>resolveVec() / resolveOpOrigin() 带深度限制(max=20)递归解析嵌套运算。</w:t>
+      </w:r>
+    </w:p>
+    <w:p>
+      <w:r>
+        <w:rPr>
+          <w:b/>
+          <w:sz w:val="22"/>
+        </w:rPr>
+        <w:t>环路检测：</w:t>
+      </w:r>
+      <w:r>
+        <w:rPr>
+          <w:sz w:val="22"/>
+        </w:rPr>
+        <w:t>hasCycle() DFS 遍历运算依赖图，防止循环引用。</w:t>
+      </w:r>
+    </w:p>
+    <w:p/>
+    <w:p>
+      <w:r>
+        <w:rPr>
+          <w:b/>
+          <w:color w:val="1A1A2E"/>
+          <w:sz w:val="28"/>
+        </w:rPr>
+        <w:t>四、构建状态</w:t>
+      </w:r>
+    </w:p>
+    <w:p>
+      <w:r>
+        <w:rPr>
+          <w:b/>
+          <w:sz w:val="22"/>
+        </w:rPr>
+        <w:t>TypeScript 0 错误 · ESLint 0 错误 · Vite 生产构建成功</w:t>
+      </w:r>
     </w:p>
     <w:sectPr>
       <w:footerReference w:type="default" r:id="rId3"/>

</xml_diff>